<commit_message>
add content to report
</commit_message>
<xml_diff>
--- a/report/24C12006_24C11060.docx
+++ b/report/24C12006_24C11060.docx
@@ -144,7 +144,13 @@
         <w:rPr>
           <w:sz w:val="32"/>
         </w:rPr>
-        <w:t>Thành phố Hồ Chí Minh, ngày 02 tháng 01 năm 2025</w:t>
+        <w:t>Thành phố Hồ Chí</w:t>
+      </w:r>
+      <w:r>
+        <w:rPr>
+          <w:sz w:val="32"/>
+        </w:rPr>
+        <w:t xml:space="preserve"> Minh, ngày 02 tháng 01 năm 2026</w:t>
       </w:r>
     </w:p>
     <w:p>
@@ -2024,6 +2030,139 @@
         </w:rPr>
         <w:t>Minh chứng:</w:t>
       </w:r>
+      <w:r>
+        <w:rPr>
+          <w:i/>
+        </w:rPr>
+        <w:t xml:space="preserve"> Xem thêm file </w:t>
+      </w:r>
+      <w:r>
+        <w:rPr>
+          <w:rFonts w:ascii="Consolas" w:hAnsi="Consolas"/>
+          <w:i/>
+          <w:highlight w:val="yellow"/>
+        </w:rPr>
+        <w:t>code/data_evaluation.ipynb</w:t>
+      </w:r>
+    </w:p>
+    <w:p>
+      <w:pPr>
+        <w:ind w:left="1418"/>
+        <w:jc w:val="both"/>
+        <w:rPr>
+          <w:i/>
+        </w:rPr>
+      </w:pPr>
+      <w:r>
+        <w:rPr>
+          <w:i/>
+          <w:noProof/>
+        </w:rPr>
+        <w:drawing>
+          <wp:inline distT="0" distB="0" distL="0" distR="0">
+            <wp:extent cx="2763614" cy="1844657"/>
+            <wp:effectExtent l="19050" t="0" r="0" b="0"/>
+            <wp:docPr id="9" name="Picture 1"/>
+            <wp:cNvGraphicFramePr>
+              <a:graphicFrameLocks xmlns:a="http://schemas.openxmlformats.org/drawingml/2006/main" noChangeAspect="1"/>
+            </wp:cNvGraphicFramePr>
+            <a:graphic xmlns:a="http://schemas.openxmlformats.org/drawingml/2006/main">
+              <a:graphicData uri="http://schemas.openxmlformats.org/drawingml/2006/picture">
+                <pic:pic xmlns:pic="http://schemas.openxmlformats.org/drawingml/2006/picture">
+                  <pic:nvPicPr>
+                    <pic:cNvPr id="0" name="Picture 1"/>
+                    <pic:cNvPicPr>
+                      <a:picLocks noChangeAspect="1" noChangeArrowheads="1"/>
+                    </pic:cNvPicPr>
+                  </pic:nvPicPr>
+                  <pic:blipFill>
+                    <a:blip r:embed="rId9" cstate="print"/>
+                    <a:srcRect/>
+                    <a:stretch>
+                      <a:fillRect/>
+                    </a:stretch>
+                  </pic:blipFill>
+                  <pic:spPr bwMode="auto">
+                    <a:xfrm>
+                      <a:off x="0" y="0"/>
+                      <a:ext cx="2763446" cy="1844545"/>
+                    </a:xfrm>
+                    <a:prstGeom prst="rect">
+                      <a:avLst/>
+                    </a:prstGeom>
+                    <a:noFill/>
+                    <a:ln w="9525">
+                      <a:noFill/>
+                      <a:miter lim="800000"/>
+                      <a:headEnd/>
+                      <a:tailEnd/>
+                    </a:ln>
+                  </pic:spPr>
+                </pic:pic>
+              </a:graphicData>
+            </a:graphic>
+          </wp:inline>
+        </w:drawing>
+      </w:r>
+    </w:p>
+    <w:p>
+      <w:pPr>
+        <w:ind w:left="1418"/>
+        <w:jc w:val="both"/>
+        <w:rPr>
+          <w:i/>
+        </w:rPr>
+      </w:pPr>
+      <w:r>
+        <w:rPr>
+          <w:i/>
+        </w:rPr>
+        <w:t xml:space="preserve">Revenue: Doanh </w:t>
+      </w:r>
+      <w:proofErr w:type="gramStart"/>
+      <w:r>
+        <w:rPr>
+          <w:i/>
+        </w:rPr>
+        <w:t>thu</w:t>
+      </w:r>
+      <w:proofErr w:type="gramEnd"/>
+      <w:r>
+        <w:rPr>
+          <w:i/>
+        </w:rPr>
+        <w:t xml:space="preserve"> theo ngày</w:t>
+      </w:r>
+    </w:p>
+    <w:p>
+      <w:pPr>
+        <w:ind w:left="1418"/>
+        <w:jc w:val="both"/>
+        <w:rPr>
+          <w:i/>
+        </w:rPr>
+      </w:pPr>
+      <w:r>
+        <w:rPr>
+          <w:i/>
+        </w:rPr>
+        <w:t>Cnt_cus: Số lượng khách trong ngày đó</w:t>
+      </w:r>
+    </w:p>
+    <w:p>
+      <w:pPr>
+        <w:ind w:left="1418"/>
+        <w:jc w:val="both"/>
+        <w:rPr>
+          <w:i/>
+        </w:rPr>
+      </w:pPr>
+      <w:r>
+        <w:rPr>
+          <w:i/>
+        </w:rPr>
+        <w:t>Cnt_pro: Số lượng sản phẩm trong ngày đó</w:t>
+      </w:r>
     </w:p>
     <w:p>
       <w:pPr>
@@ -2248,6 +2387,7 @@
         <w:ind w:left="1843"/>
         <w:jc w:val="both"/>
         <w:rPr>
+          <w:rStyle w:val="katex-mathml"/>
           <w:i/>
         </w:rPr>
       </w:pPr>
@@ -2268,6 +2408,26 @@
           <w:rStyle w:val="katex-mathml"/>
         </w:rPr>
         <w:t>t</w:t>
+      </w:r>
+    </w:p>
+    <w:p>
+      <w:pPr>
+        <w:pStyle w:val="ListParagraph"/>
+        <w:numPr>
+          <w:ilvl w:val="0"/>
+          <w:numId w:val="14"/>
+        </w:numPr>
+        <w:ind w:left="1843"/>
+        <w:jc w:val="both"/>
+        <w:rPr>
+          <w:i/>
+        </w:rPr>
+      </w:pPr>
+      <w:r>
+        <w:rPr>
+          <w:rStyle w:val="katex-mathml"/>
+        </w:rPr>
+        <w:t>Số lượng khách hàng đã mua sản phẩm p tại ngày t</w:t>
       </w:r>
     </w:p>
     <w:p>
@@ -2275,6 +2435,7 @@
         <w:ind w:left="1418"/>
         <w:jc w:val="both"/>
         <w:rPr>
+          <w:rFonts w:ascii="Consolas" w:hAnsi="Consolas"/>
           <w:i/>
         </w:rPr>
       </w:pPr>
@@ -2283,6 +2444,155 @@
           <w:i/>
         </w:rPr>
         <w:t>Minh chứng:</w:t>
+      </w:r>
+      <w:r>
+        <w:rPr>
+          <w:i/>
+        </w:rPr>
+        <w:t xml:space="preserve"> Xem thêm file </w:t>
+      </w:r>
+      <w:r>
+        <w:rPr>
+          <w:rFonts w:ascii="Consolas" w:hAnsi="Consolas"/>
+          <w:i/>
+          <w:highlight w:val="yellow"/>
+        </w:rPr>
+        <w:t>code/data_evaluation.ipynb</w:t>
+      </w:r>
+    </w:p>
+    <w:p>
+      <w:pPr>
+        <w:ind w:left="1418"/>
+        <w:jc w:val="both"/>
+        <w:rPr>
+          <w:i/>
+        </w:rPr>
+      </w:pPr>
+      <w:r>
+        <w:rPr>
+          <w:i/>
+        </w:rPr>
+        <w:t xml:space="preserve">Revenue: Doanh </w:t>
+      </w:r>
+      <w:proofErr w:type="gramStart"/>
+      <w:r>
+        <w:rPr>
+          <w:i/>
+        </w:rPr>
+        <w:t>thu</w:t>
+      </w:r>
+      <w:proofErr w:type="gramEnd"/>
+      <w:r>
+        <w:rPr>
+          <w:i/>
+        </w:rPr>
+        <w:t xml:space="preserve"> của sản phẩm p trong ngày t</w:t>
+      </w:r>
+    </w:p>
+    <w:p>
+      <w:pPr>
+        <w:ind w:left="1418"/>
+        <w:jc w:val="both"/>
+        <w:rPr>
+          <w:i/>
+        </w:rPr>
+      </w:pPr>
+      <w:r>
+        <w:rPr>
+          <w:i/>
+        </w:rPr>
+        <w:t>Cnt_cus: Số lượng khách mua sản phẩm p trong ngày t</w:t>
+      </w:r>
+    </w:p>
+    <w:p>
+      <w:pPr>
+        <w:ind w:left="1418"/>
+        <w:jc w:val="both"/>
+        <w:rPr>
+          <w:i/>
+        </w:rPr>
+      </w:pPr>
+      <w:r>
+        <w:rPr>
+          <w:i/>
+        </w:rPr>
+        <w:t>Cnt_pro: Số lượng sản phẩm p trong ngày t</w:t>
+      </w:r>
+    </w:p>
+    <w:p>
+      <w:pPr>
+        <w:ind w:left="1418"/>
+        <w:jc w:val="both"/>
+        <w:rPr>
+          <w:i/>
+        </w:rPr>
+      </w:pPr>
+      <w:r>
+        <w:rPr>
+          <w:i/>
+        </w:rPr>
+        <w:t>Cnt_trans: Số lượng lượng giao dịch có sản phẩm p trong ngày t</w:t>
+      </w:r>
+    </w:p>
+    <w:p>
+      <w:pPr>
+        <w:ind w:left="1418"/>
+        <w:jc w:val="both"/>
+        <w:rPr>
+          <w:i/>
+        </w:rPr>
+      </w:pPr>
+      <w:r>
+        <w:rPr>
+          <w:i/>
+          <w:noProof/>
+        </w:rPr>
+        <w:lastRenderedPageBreak/>
+        <w:drawing>
+          <wp:inline distT="0" distB="0" distL="0" distR="0">
+            <wp:extent cx="4430448" cy="1908083"/>
+            <wp:effectExtent l="19050" t="0" r="8202" b="0"/>
+            <wp:docPr id="12" name="Picture 7"/>
+            <wp:cNvGraphicFramePr>
+              <a:graphicFrameLocks xmlns:a="http://schemas.openxmlformats.org/drawingml/2006/main" noChangeAspect="1"/>
+            </wp:cNvGraphicFramePr>
+            <a:graphic xmlns:a="http://schemas.openxmlformats.org/drawingml/2006/main">
+              <a:graphicData uri="http://schemas.openxmlformats.org/drawingml/2006/picture">
+                <pic:pic xmlns:pic="http://schemas.openxmlformats.org/drawingml/2006/picture">
+                  <pic:nvPicPr>
+                    <pic:cNvPr id="0" name="Picture 7"/>
+                    <pic:cNvPicPr>
+                      <a:picLocks noChangeAspect="1" noChangeArrowheads="1"/>
+                    </pic:cNvPicPr>
+                  </pic:nvPicPr>
+                  <pic:blipFill>
+                    <a:blip r:embed="rId10" cstate="print"/>
+                    <a:srcRect/>
+                    <a:stretch>
+                      <a:fillRect/>
+                    </a:stretch>
+                  </pic:blipFill>
+                  <pic:spPr bwMode="auto">
+                    <a:xfrm>
+                      <a:off x="0" y="0"/>
+                      <a:ext cx="4433247" cy="1909289"/>
+                    </a:xfrm>
+                    <a:prstGeom prst="rect">
+                      <a:avLst/>
+                    </a:prstGeom>
+                    <a:noFill/>
+                    <a:ln w="9525">
+                      <a:noFill/>
+                      <a:miter lim="800000"/>
+                      <a:headEnd/>
+                      <a:tailEnd/>
+                    </a:ln>
+                  </pic:spPr>
+                </pic:pic>
+              </a:graphicData>
+            </a:graphic>
+          </wp:inline>
+        </w:drawing>
       </w:r>
     </w:p>
     <w:p>
@@ -2612,6 +2922,7 @@
         <w:ind w:left="1418"/>
         <w:jc w:val="both"/>
         <w:rPr>
+          <w:rFonts w:ascii="Consolas" w:hAnsi="Consolas"/>
           <w:i/>
         </w:rPr>
       </w:pPr>
@@ -2627,6 +2938,89 @@
         </w:rPr>
         <w:t>Minh chứng:</w:t>
       </w:r>
+      <w:r>
+        <w:rPr>
+          <w:i/>
+        </w:rPr>
+        <w:t xml:space="preserve"> Xem thêm file </w:t>
+      </w:r>
+      <w:r>
+        <w:rPr>
+          <w:rFonts w:ascii="Consolas" w:hAnsi="Consolas"/>
+          <w:i/>
+          <w:highlight w:val="yellow"/>
+        </w:rPr>
+        <w:t>code/data_evaluation.ipynb</w:t>
+      </w:r>
+    </w:p>
+    <w:p>
+      <w:pPr>
+        <w:ind w:left="1418"/>
+        <w:jc w:val="both"/>
+        <w:rPr>
+          <w:i/>
+        </w:rPr>
+      </w:pPr>
+      <w:r>
+        <w:rPr>
+          <w:i/>
+        </w:rPr>
+        <w:t>Revenue: Doanh thu của khách hàng c trong ngày t</w:t>
+      </w:r>
+    </w:p>
+    <w:p>
+      <w:pPr>
+        <w:ind w:left="1418"/>
+        <w:jc w:val="both"/>
+        <w:rPr>
+          <w:i/>
+        </w:rPr>
+      </w:pPr>
+      <w:r>
+        <w:rPr>
+          <w:i/>
+        </w:rPr>
+        <w:t>Cnt_cus: Số lượng khách mua sản phẩm p trong ngày t</w:t>
+      </w:r>
+    </w:p>
+    <w:p>
+      <w:pPr>
+        <w:ind w:left="1418"/>
+        <w:jc w:val="both"/>
+        <w:rPr>
+          <w:i/>
+        </w:rPr>
+      </w:pPr>
+      <w:r>
+        <w:rPr>
+          <w:i/>
+        </w:rPr>
+        <w:t>Cnt_pro: Số lượng sản phẩm p trong ngày t</w:t>
+      </w:r>
+    </w:p>
+    <w:p>
+      <w:pPr>
+        <w:ind w:left="1418"/>
+        <w:jc w:val="both"/>
+        <w:rPr>
+          <w:i/>
+        </w:rPr>
+      </w:pPr>
+      <w:r>
+        <w:rPr>
+          <w:i/>
+        </w:rPr>
+        <w:t>Cnt_trans: Số lượng lượng giao dịch có sản phẩm p trong ngày t</w:t>
+      </w:r>
+    </w:p>
+    <w:p>
+      <w:pPr>
+        <w:ind w:left="1418"/>
+        <w:jc w:val="both"/>
+        <w:rPr>
+          <w:i/>
+        </w:rPr>
+      </w:pPr>
     </w:p>
     <w:p>
       <w:pPr>
@@ -2816,6 +3210,20 @@
           <w:i/>
         </w:rPr>
         <w:t>Minh chứng:</w:t>
+      </w:r>
+      <w:r>
+        <w:rPr>
+          <w:i/>
+        </w:rPr>
+        <w:t xml:space="preserve"> Xem thêm file </w:t>
+      </w:r>
+      <w:r>
+        <w:rPr>
+          <w:rFonts w:ascii="Consolas" w:hAnsi="Consolas"/>
+          <w:i/>
+          <w:highlight w:val="yellow"/>
+        </w:rPr>
+        <w:t>code/data_evaluation.ipynb</w:t>
       </w:r>
     </w:p>
     <w:p>
@@ -2895,7 +3303,7 @@
                     <pic:cNvPicPr/>
                   </pic:nvPicPr>
                   <pic:blipFill>
-                    <a:blip r:embed="rId9" cstate="print"/>
+                    <a:blip r:embed="rId11" cstate="print"/>
                     <a:stretch>
                       <a:fillRect/>
                     </a:stretch>
@@ -2950,7 +3358,7 @@
                     <pic:cNvPicPr/>
                   </pic:nvPicPr>
                   <pic:blipFill>
-                    <a:blip r:embed="rId10" cstate="print"/>
+                    <a:blip r:embed="rId12" cstate="print"/>
                     <a:stretch>
                       <a:fillRect/>
                     </a:stretch>
@@ -3076,7 +3484,7 @@
                     <pic:cNvPicPr/>
                   </pic:nvPicPr>
                   <pic:blipFill>
-                    <a:blip r:embed="rId11" cstate="print"/>
+                    <a:blip r:embed="rId13" cstate="print"/>
                     <a:stretch>
                       <a:fillRect/>
                     </a:stretch>
@@ -3130,7 +3538,7 @@
                     <pic:cNvPicPr/>
                   </pic:nvPicPr>
                   <pic:blipFill>
-                    <a:blip r:embed="rId12" cstate="print"/>
+                    <a:blip r:embed="rId14" cstate="print"/>
                     <a:stretch>
                       <a:fillRect/>
                     </a:stretch>
@@ -3237,7 +3645,7 @@
                     <pic:cNvPicPr/>
                   </pic:nvPicPr>
                   <pic:blipFill>
-                    <a:blip r:embed="rId13" cstate="print"/>
+                    <a:blip r:embed="rId15" cstate="print"/>
                     <a:stretch>
                       <a:fillRect/>
                     </a:stretch>
@@ -3326,7 +3734,7 @@
                     <pic:cNvPicPr/>
                   </pic:nvPicPr>
                   <pic:blipFill>
-                    <a:blip r:embed="rId14" cstate="print"/>
+                    <a:blip r:embed="rId16" cstate="print"/>
                     <a:stretch>
                       <a:fillRect/>
                     </a:stretch>
@@ -3483,7 +3891,7 @@
                     <pic:cNvPicPr/>
                   </pic:nvPicPr>
                   <pic:blipFill>
-                    <a:blip r:embed="rId15" cstate="print"/>
+                    <a:blip r:embed="rId17" cstate="print"/>
                     <a:stretch>
                       <a:fillRect/>
                     </a:stretch>
@@ -3783,7 +4191,7 @@
                     <pic:cNvPicPr/>
                   </pic:nvPicPr>
                   <pic:blipFill>
-                    <a:blip r:embed="rId16" cstate="print"/>
+                    <a:blip r:embed="rId18" cstate="print"/>
                     <a:stretch>
                       <a:fillRect/>
                     </a:stretch>
@@ -3849,7 +4257,7 @@
                     </pic:cNvPicPr>
                   </pic:nvPicPr>
                   <pic:blipFill>
-                    <a:blip r:embed="rId17" cstate="print"/>
+                    <a:blip r:embed="rId19" cstate="print"/>
                     <a:srcRect/>
                     <a:stretch>
                       <a:fillRect/>
@@ -3965,7 +4373,7 @@
                     </pic:cNvPicPr>
                   </pic:nvPicPr>
                   <pic:blipFill>
-                    <a:blip r:embed="rId18" cstate="print"/>
+                    <a:blip r:embed="rId20" cstate="print"/>
                     <a:srcRect/>
                     <a:stretch>
                       <a:fillRect/>
@@ -4026,7 +4434,7 @@
                     <pic:cNvPicPr/>
                   </pic:nvPicPr>
                   <pic:blipFill>
-                    <a:blip r:embed="rId19" cstate="print"/>
+                    <a:blip r:embed="rId21" cstate="print"/>
                     <a:stretch>
                       <a:fillRect/>
                     </a:stretch>
@@ -4192,7 +4600,7 @@
                     <pic:cNvPicPr/>
                   </pic:nvPicPr>
                   <pic:blipFill>
-                    <a:blip r:embed="rId20" cstate="print"/>
+                    <a:blip r:embed="rId22" cstate="print"/>
                     <a:stretch>
                       <a:fillRect/>
                     </a:stretch>
@@ -7836,7 +8244,7 @@
   <a:extraClrSchemeLst/>
   <a:extLst>
     <a:ext uri="{05A4C25C-085E-4340-85A3-A5531E510DB2}">
-      <thm15:themeFamily xmlns:thm15="http://schemas.microsoft.com/office/thememl/2012/main" xmlns="" name="Office Theme" id="{62F939B6-93AF-4DB8-9C6B-D6C7DFDC589F}" vid="{4A3C46E8-61CC-4603-A589-7422A47A8E4A}"/>
+      <thm15:themeFamily xmlns="" xmlns:thm15="http://schemas.microsoft.com/office/thememl/2012/main" name="Office Theme" id="{62F939B6-93AF-4DB8-9C6B-D6C7DFDC589F}" vid="{4A3C46E8-61CC-4603-A589-7422A47A8E4A}"/>
     </a:ext>
   </a:extLst>
 </a:theme>

</xml_diff>